<commit_message>
fix(kltn): chapter headings use template auto-numbering, cancel on non-chapter u1
Co-Authored-By: Claude Fable 5 <noreply@anthropic.com>
</commit_message>
<xml_diff>
--- a/thesis/KLTN_GHEP.docx
+++ b/thesis/KLTN_GHEP.docx
@@ -11519,6 +11519,10 @@
     <w:p>
       <w:pPr>
         <w:pStyle w:val="u1"/>
+        <w:numPr>
+          <w:ilvl w:val="0"/>
+          <w:numId w:val="0"/>
+        </w:numPr>
       </w:pPr>
       <w:r>
         <w:rPr>
@@ -11606,7 +11610,7 @@
           <w:sz w:val="26"/>
           <w:szCs w:val="26"/>
         </w:rPr>
-        <w:t xml:space="preserve">CHƯƠNG 1. TỔNG QUAN</w:t>
+        <w:t xml:space="preserve"> TỔNG QUAN</w:t>
       </w:r>
     </w:p>
     <w:p>
@@ -12073,7 +12077,7 @@
           <w:sz w:val="26"/>
           <w:szCs w:val="26"/>
         </w:rPr>
-        <w:t xml:space="preserve">CHƯƠNG 2. CƠ SỞ LÝ THUYẾT</w:t>
+        <w:t xml:space="preserve"> CƠ SỞ LÝ THUYẾT</w:t>
       </w:r>
     </w:p>
     <w:p>
@@ -12630,7 +12634,7 @@
           <w:sz w:val="26"/>
           <w:szCs w:val="26"/>
         </w:rPr>
-        <w:t xml:space="preserve">CHƯƠNG 3. THIẾT KẾ VÀ HIỆN THỰC HỆ THỐNG</w:t>
+        <w:t xml:space="preserve"> THIẾT KẾ VÀ HIỆN THỰC HỆ THỐNG</w:t>
       </w:r>
     </w:p>
     <w:p>
@@ -17743,7 +17747,7 @@
           <w:sz w:val="26"/>
           <w:szCs w:val="26"/>
         </w:rPr>
-        <w:t xml:space="preserve">CHƯƠNG 4. PHÂN TÍCH VÀ ĐÁNH GIÁ KẾT QUẢ</w:t>
+        <w:t xml:space="preserve"> PHÂN TÍCH VÀ ĐÁNH GIÁ KẾT QUẢ</w:t>
       </w:r>
     </w:p>
     <w:p>
@@ -24991,6 +24995,10 @@
     <w:p>
       <w:pPr>
         <w:pStyle w:val="u1"/>
+        <w:numPr>
+          <w:ilvl w:val="0"/>
+          <w:numId w:val="0"/>
+        </w:numPr>
         <w:pageBreakBefore/>
       </w:pPr>
       <w:r>

</xml_diff>

<commit_message>
docs(kltn): fix justified-line stretch (unbreakable token) + embed 4 figures into KLTN_GHEP.docx
Co-Authored-By: Claude Fable 5 <noreply@anthropic.com>
</commit_message>
<xml_diff>
--- a/thesis/KLTN_GHEP.docx
+++ b/thesis/KLTN_GHEP.docx
@@ -13053,29 +13053,41 @@
     </w:p>
     <w:p>
       <w:pPr>
-        <w:spacing w:after="120" w:line="360" w:lineRule="auto"/>
         <w:jc w:val="center"/>
-      </w:pPr>
-      <w:r>
-        <w:rPr>
-          <w:sz w:val="26"/>
-          <w:szCs w:val="26"/>
-        </w:rPr>
-        <w:t xml:space="preserve">【HÌNH 3.1 — Kiến trúc tổng thể ba tầng: xuất PNG từ sơ đồ Mermaid "Topology tổng thể" trong </w:t>
-      </w:r>
-      <w:r>
-        <w:rPr>
-          <w:sz w:val="26"/>
-          <w:szCs w:val="26"/>
-        </w:rPr>
-        <w:t xml:space="preserve">docs/architecture.md</w:t>
-      </w:r>
-      <w:r>
-        <w:rPr>
-          <w:sz w:val="26"/>
-          <w:szCs w:val="26"/>
-        </w:rPr>
-        <w:t xml:space="preserve">】</w:t>
+        <w:spacing w:before="120" w:after="60"/>
+      </w:pPr>
+      <w:r>
+        <w:drawing>
+          <wp:inline xmlns:wp="http://schemas.openxmlformats.org/drawingml/2006/wordprocessingDrawing" distT="0" distB="0" distL="0" distR="0">
+            <wp:extent cx="5400000" cy="3720000"/>
+            <wp:docPr id="9001" name="KltnHinh1"/>
+            <a:graphic xmlns:a="http://schemas.openxmlformats.org/drawingml/2006/main">
+              <a:graphicData uri="http://schemas.openxmlformats.org/drawingml/2006/picture">
+                <pic:pic xmlns:pic="http://schemas.openxmlformats.org/drawingml/2006/picture">
+                  <pic:nvPicPr>
+                    <pic:cNvPr id="9001" name="KltnHinh1"/>
+                    <pic:cNvPicPr/>
+                  </pic:nvPicPr>
+                  <pic:blipFill>
+                    <a:blip xmlns:r="http://schemas.openxmlformats.org/officeDocument/2006/relationships" r:embed="rIdKltnImg1"/>
+                    <a:stretch>
+                      <a:fillRect/>
+                    </a:stretch>
+                  </pic:blipFill>
+                  <pic:spPr>
+                    <a:xfrm>
+                      <a:off x="0" y="0"/>
+                      <a:ext cx="5400000" cy="3720000"/>
+                    </a:xfrm>
+                    <a:prstGeom prst="rect">
+                      <a:avLst/>
+                    </a:prstGeom>
+                  </pic:spPr>
+                </pic:pic>
+              </a:graphicData>
+            </a:graphic>
+          </wp:inline>
+        </w:drawing>
       </w:r>
     </w:p>
     <w:p>
@@ -13168,29 +13180,41 @@
     </w:p>
     <w:p>
       <w:pPr>
-        <w:spacing w:after="120" w:line="360" w:lineRule="auto"/>
         <w:jc w:val="center"/>
-      </w:pPr>
-      <w:r>
-        <w:rPr>
-          <w:sz w:val="26"/>
-          <w:szCs w:val="26"/>
-        </w:rPr>
-        <w:t xml:space="preserve">【HÌNH 3.2 — Sơ đồ module NestJS: xuất PNG từ sơ đồ Mermaid "Bên trong NestJS" trong </w:t>
-      </w:r>
-      <w:r>
-        <w:rPr>
-          <w:sz w:val="26"/>
-          <w:szCs w:val="26"/>
-        </w:rPr>
-        <w:t xml:space="preserve">docs/architecture.md</w:t>
-      </w:r>
-      <w:r>
-        <w:rPr>
-          <w:sz w:val="26"/>
-          <w:szCs w:val="26"/>
-        </w:rPr>
-        <w:t xml:space="preserve">】</w:t>
+        <w:spacing w:before="120" w:after="60"/>
+      </w:pPr>
+      <w:r>
+        <w:drawing>
+          <wp:inline xmlns:wp="http://schemas.openxmlformats.org/drawingml/2006/wordprocessingDrawing" distT="0" distB="0" distL="0" distR="0">
+            <wp:extent cx="5400000" cy="3262500"/>
+            <wp:docPr id="9002" name="KltnHinh2"/>
+            <a:graphic xmlns:a="http://schemas.openxmlformats.org/drawingml/2006/main">
+              <a:graphicData uri="http://schemas.openxmlformats.org/drawingml/2006/picture">
+                <pic:pic xmlns:pic="http://schemas.openxmlformats.org/drawingml/2006/picture">
+                  <pic:nvPicPr>
+                    <pic:cNvPr id="9002" name="KltnHinh2"/>
+                    <pic:cNvPicPr/>
+                  </pic:nvPicPr>
+                  <pic:blipFill>
+                    <a:blip xmlns:r="http://schemas.openxmlformats.org/officeDocument/2006/relationships" r:embed="rIdKltnImg2"/>
+                    <a:stretch>
+                      <a:fillRect/>
+                    </a:stretch>
+                  </pic:blipFill>
+                  <pic:spPr>
+                    <a:xfrm>
+                      <a:off x="0" y="0"/>
+                      <a:ext cx="5400000" cy="3262500"/>
+                    </a:xfrm>
+                    <a:prstGeom prst="rect">
+                      <a:avLst/>
+                    </a:prstGeom>
+                  </pic:spPr>
+                </pic:pic>
+              </a:graphicData>
+            </a:graphic>
+          </wp:inline>
+        </w:drawing>
       </w:r>
     </w:p>
     <w:p>
@@ -13340,29 +13364,41 @@
     </w:p>
     <w:p>
       <w:pPr>
-        <w:spacing w:after="120" w:line="360" w:lineRule="auto"/>
         <w:jc w:val="center"/>
-      </w:pPr>
-      <w:r>
-        <w:rPr>
-          <w:sz w:val="26"/>
-          <w:szCs w:val="26"/>
-        </w:rPr>
-        <w:t xml:space="preserve">【HÌNH 3.3 — ERD rút gọn: xuất từ sơ đồ Mermaid erDiagram trong </w:t>
-      </w:r>
-      <w:r>
-        <w:rPr>
-          <w:sz w:val="26"/>
-          <w:szCs w:val="26"/>
-        </w:rPr>
-        <w:t xml:space="preserve">docs/architecture.md</w:t>
-      </w:r>
-      <w:r>
-        <w:rPr>
-          <w:sz w:val="26"/>
-          <w:szCs w:val="26"/>
-        </w:rPr>
-        <w:t xml:space="preserve">, bổ sung Department, Category, PageLayoutVersion】</w:t>
+        <w:spacing w:before="120" w:after="60"/>
+      </w:pPr>
+      <w:r>
+        <w:drawing>
+          <wp:inline xmlns:wp="http://schemas.openxmlformats.org/drawingml/2006/wordprocessingDrawing" distT="0" distB="0" distL="0" distR="0">
+            <wp:extent cx="5400000" cy="3780000"/>
+            <wp:docPr id="9003" name="KltnHinh3"/>
+            <a:graphic xmlns:a="http://schemas.openxmlformats.org/drawingml/2006/main">
+              <a:graphicData uri="http://schemas.openxmlformats.org/drawingml/2006/picture">
+                <pic:pic xmlns:pic="http://schemas.openxmlformats.org/drawingml/2006/picture">
+                  <pic:nvPicPr>
+                    <pic:cNvPr id="9003" name="KltnHinh3"/>
+                    <pic:cNvPicPr/>
+                  </pic:nvPicPr>
+                  <pic:blipFill>
+                    <a:blip xmlns:r="http://schemas.openxmlformats.org/officeDocument/2006/relationships" r:embed="rIdKltnImg3"/>
+                    <a:stretch>
+                      <a:fillRect/>
+                    </a:stretch>
+                  </pic:blipFill>
+                  <pic:spPr>
+                    <a:xfrm>
+                      <a:off x="0" y="0"/>
+                      <a:ext cx="5400000" cy="3780000"/>
+                    </a:xfrm>
+                    <a:prstGeom prst="rect">
+                      <a:avLst/>
+                    </a:prstGeom>
+                  </pic:spPr>
+                </pic:pic>
+              </a:graphicData>
+            </a:graphic>
+          </wp:inline>
+        </w:drawing>
       </w:r>
     </w:p>
     <w:p>
@@ -14746,7 +14782,7 @@
           <w:sz w:val="26"/>
           <w:szCs w:val="26"/>
         </w:rPr>
-        <w:t xml:space="preserve"> (ADMIN). Khảo sát hệ thống cũ cho thấy bộ bốn bảng phân quyền chi tiết (role/permission/permissiongroup/permissionrole) trên thực tế không được sử dụng đúng thiết kế; mô hình hai vai trò phẳng, bổ sung chiều phạm vi bộ môn (3.4.4), phản ánh đúng cách tổ chức thực của Khoa mà vẫn đơn giản để vận hành.</w:t>
+        <w:t xml:space="preserve"> (ADMIN). Khảo sát hệ thống cũ cho thấy bộ bốn bảng phân quyền chi tiết của nguồn (role, permission, permissiongroup, permissionrole) trên thực tế không được sử dụng đúng thiết kế; mô hình hai vai trò phẳng, bổ sung chiều phạm vi bộ môn (3.4.4), phản ánh đúng cách tổ chức thực của Khoa mà vẫn đơn giản để vận hành.</w:t>
       </w:r>
     </w:p>
     <w:p>
@@ -15505,29 +15541,41 @@
     </w:p>
     <w:p>
       <w:pPr>
-        <w:spacing w:after="120" w:line="360" w:lineRule="auto"/>
         <w:jc w:val="center"/>
-      </w:pPr>
-      <w:r>
-        <w:rPr>
-          <w:sz w:val="26"/>
-          <w:szCs w:val="26"/>
-        </w:rPr>
-        <w:t xml:space="preserve">【HÌNH 3.6 — Sơ đồ tuần tự post → layout → publish: xuất PNG từ sơ đồ Mermaid "Luồng tạo bài đăng" trong </w:t>
-      </w:r>
-      <w:r>
-        <w:rPr>
-          <w:sz w:val="26"/>
-          <w:szCs w:val="26"/>
-        </w:rPr>
-        <w:t xml:space="preserve">docs/architecture.md</w:t>
-      </w:r>
-      <w:r>
-        <w:rPr>
-          <w:sz w:val="26"/>
-          <w:szCs w:val="26"/>
-        </w:rPr>
-        <w:t xml:space="preserve">】</w:t>
+        <w:spacing w:before="120" w:after="60"/>
+      </w:pPr>
+      <w:r>
+        <w:drawing>
+          <wp:inline xmlns:wp="http://schemas.openxmlformats.org/drawingml/2006/wordprocessingDrawing" distT="0" distB="0" distL="0" distR="0">
+            <wp:extent cx="5400000" cy="3712500"/>
+            <wp:docPr id="9004" name="KltnHinh4"/>
+            <a:graphic xmlns:a="http://schemas.openxmlformats.org/drawingml/2006/main">
+              <a:graphicData uri="http://schemas.openxmlformats.org/drawingml/2006/picture">
+                <pic:pic xmlns:pic="http://schemas.openxmlformats.org/drawingml/2006/picture">
+                  <pic:nvPicPr>
+                    <pic:cNvPr id="9004" name="KltnHinh4"/>
+                    <pic:cNvPicPr/>
+                  </pic:nvPicPr>
+                  <pic:blipFill>
+                    <a:blip xmlns:r="http://schemas.openxmlformats.org/officeDocument/2006/relationships" r:embed="rIdKltnImg4"/>
+                    <a:stretch>
+                      <a:fillRect/>
+                    </a:stretch>
+                  </pic:blipFill>
+                  <pic:spPr>
+                    <a:xfrm>
+                      <a:off x="0" y="0"/>
+                      <a:ext cx="5400000" cy="3712500"/>
+                    </a:xfrm>
+                    <a:prstGeom prst="rect">
+                      <a:avLst/>
+                    </a:prstGeom>
+                  </pic:spPr>
+                </pic:pic>
+              </a:graphicData>
+            </a:graphic>
+          </wp:inline>
+        </w:drawing>
       </w:r>
     </w:p>
     <w:p>
@@ -25330,7 +25378,7 @@
     <w:p>
       <w:pPr>
         <w:spacing w:after="120" w:line="360" w:lineRule="auto"/>
-        <w:jc w:val="both"/>
+        <w:jc w:val="left"/>
       </w:pPr>
       <w:r>
         <w:rPr>
@@ -25343,7 +25391,7 @@
     <w:p>
       <w:pPr>
         <w:spacing w:after="120" w:line="360" w:lineRule="auto"/>
-        <w:jc w:val="both"/>
+        <w:jc w:val="left"/>
       </w:pPr>
       <w:r>
         <w:rPr>
@@ -25356,7 +25404,7 @@
     <w:p>
       <w:pPr>
         <w:spacing w:after="120" w:line="360" w:lineRule="auto"/>
-        <w:jc w:val="both"/>
+        <w:jc w:val="left"/>
       </w:pPr>
       <w:r>
         <w:rPr>
@@ -25369,7 +25417,7 @@
     <w:p>
       <w:pPr>
         <w:spacing w:after="120" w:line="360" w:lineRule="auto"/>
-        <w:jc w:val="both"/>
+        <w:jc w:val="left"/>
       </w:pPr>
       <w:r>
         <w:rPr>
@@ -25382,7 +25430,7 @@
     <w:p>
       <w:pPr>
         <w:spacing w:after="120" w:line="360" w:lineRule="auto"/>
-        <w:jc w:val="both"/>
+        <w:jc w:val="left"/>
       </w:pPr>
       <w:r>
         <w:rPr>
@@ -25395,7 +25443,7 @@
     <w:p>
       <w:pPr>
         <w:spacing w:after="120" w:line="360" w:lineRule="auto"/>
-        <w:jc w:val="both"/>
+        <w:jc w:val="left"/>
       </w:pPr>
       <w:r>
         <w:rPr>
@@ -25424,7 +25472,7 @@
     <w:p>
       <w:pPr>
         <w:spacing w:after="120" w:line="360" w:lineRule="auto"/>
-        <w:jc w:val="both"/>
+        <w:jc w:val="left"/>
       </w:pPr>
       <w:r>
         <w:rPr>
@@ -25437,7 +25485,7 @@
     <w:p>
       <w:pPr>
         <w:spacing w:after="120" w:line="360" w:lineRule="auto"/>
-        <w:jc w:val="both"/>
+        <w:jc w:val="left"/>
       </w:pPr>
       <w:r>
         <w:rPr>
@@ -25450,7 +25498,7 @@
     <w:p>
       <w:pPr>
         <w:spacing w:after="120" w:line="360" w:lineRule="auto"/>
-        <w:jc w:val="both"/>
+        <w:jc w:val="left"/>
       </w:pPr>
       <w:r>
         <w:rPr>
@@ -25463,7 +25511,7 @@
     <w:p>
       <w:pPr>
         <w:spacing w:after="120" w:line="360" w:lineRule="auto"/>
-        <w:jc w:val="both"/>
+        <w:jc w:val="left"/>
       </w:pPr>
       <w:r>
         <w:rPr>
@@ -25476,7 +25524,7 @@
     <w:p>
       <w:pPr>
         <w:spacing w:after="120" w:line="360" w:lineRule="auto"/>
-        <w:jc w:val="both"/>
+        <w:jc w:val="left"/>
       </w:pPr>
       <w:r>
         <w:rPr>
@@ -25489,7 +25537,7 @@
     <w:p>
       <w:pPr>
         <w:spacing w:after="120" w:line="360" w:lineRule="auto"/>
-        <w:jc w:val="both"/>
+        <w:jc w:val="left"/>
       </w:pPr>
       <w:r>
         <w:rPr>
@@ -25502,7 +25550,7 @@
     <w:p>
       <w:pPr>
         <w:spacing w:after="120" w:line="360" w:lineRule="auto"/>
-        <w:jc w:val="both"/>
+        <w:jc w:val="left"/>
       </w:pPr>
       <w:r>
         <w:rPr>
@@ -25515,7 +25563,7 @@
     <w:p>
       <w:pPr>
         <w:spacing w:after="120" w:line="360" w:lineRule="auto"/>
-        <w:jc w:val="both"/>
+        <w:jc w:val="left"/>
       </w:pPr>
       <w:r>
         <w:rPr>
@@ -25528,7 +25576,7 @@
     <w:p>
       <w:pPr>
         <w:spacing w:after="120" w:line="360" w:lineRule="auto"/>
-        <w:jc w:val="both"/>
+        <w:jc w:val="left"/>
       </w:pPr>
       <w:r>
         <w:rPr>

</xml_diff>